<commit_message>
feat: rebuilt reports LR1-LR7, project summary and final report with the current report-gen: reference sentences, table continuations, appendix headings
</commit_message>
<xml_diff>
--- a/ПРОВЕРИТЬ_ОТЧЕТЫ/ОТЧЕТ_ЛР5_NotaCode.docx
+++ b/ПРОВЕРИТЬ_ОТЧЕТЫ/ОТЧЕТ_ЛР5_NotaCode.docx
@@ -186,7 +186,7 @@
       <w:r>
         <w:fldChar w:fldCharType="separate"/>
       </w:r>
-      <w:hyperlink w:anchor="_Toc242215067" w:history="1">
+      <w:hyperlink w:anchor="_Toc242275593" w:history="1">
         <w:r>
           <w:rPr>
             <w:rStyle w:val="ad"/>
@@ -213,7 +213,7 @@
             <w:noProof/>
             <w:webHidden/>
           </w:rPr>
-          <w:instrText xml:space="preserve"> PAGEREF _Toc242215067 \h </w:instrText>
+          <w:instrText xml:space="preserve"> PAGEREF _Toc242275593 \h </w:instrText>
         </w:r>
         <w:r>
           <w:rPr>
@@ -259,7 +259,7 @@
           <w14:ligatures w14:val="standardContextual"/>
         </w:rPr>
       </w:pPr>
-      <w:hyperlink w:anchor="_Toc242215068" w:history="1">
+      <w:hyperlink w:anchor="_Toc242275594" w:history="1">
         <w:r>
           <w:rPr>
             <w:rStyle w:val="ad"/>
@@ -286,7 +286,7 @@
             <w:noProof/>
             <w:webHidden/>
           </w:rPr>
-          <w:instrText xml:space="preserve"> PAGEREF _Toc242215068 \h </w:instrText>
+          <w:instrText xml:space="preserve"> PAGEREF _Toc242275594 \h </w:instrText>
         </w:r>
         <w:r>
           <w:rPr>
@@ -332,7 +332,7 @@
           <w14:ligatures w14:val="standardContextual"/>
         </w:rPr>
       </w:pPr>
-      <w:hyperlink w:anchor="_Toc242215069" w:history="1">
+      <w:hyperlink w:anchor="_Toc242275595" w:history="1">
         <w:r>
           <w:rPr>
             <w:rStyle w:val="ad"/>
@@ -359,7 +359,7 @@
             <w:noProof/>
             <w:webHidden/>
           </w:rPr>
-          <w:instrText xml:space="preserve"> PAGEREF _Toc242215069 \h </w:instrText>
+          <w:instrText xml:space="preserve"> PAGEREF _Toc242275595 \h </w:instrText>
         </w:r>
         <w:r>
           <w:rPr>
@@ -405,7 +405,7 @@
           <w14:ligatures w14:val="standardContextual"/>
         </w:rPr>
       </w:pPr>
-      <w:hyperlink w:anchor="_Toc242215070" w:history="1">
+      <w:hyperlink w:anchor="_Toc242275596" w:history="1">
         <w:r>
           <w:rPr>
             <w:rStyle w:val="ad"/>
@@ -448,7 +448,7 @@
             <w:noProof/>
             <w:webHidden/>
           </w:rPr>
-          <w:instrText xml:space="preserve"> PAGEREF _Toc242215070 \h </w:instrText>
+          <w:instrText xml:space="preserve"> PAGEREF _Toc242275596 \h </w:instrText>
         </w:r>
         <w:r>
           <w:rPr>
@@ -494,7 +494,7 @@
           <w14:ligatures w14:val="standardContextual"/>
         </w:rPr>
       </w:pPr>
-      <w:hyperlink w:anchor="_Toc242215071" w:history="1">
+      <w:hyperlink w:anchor="_Toc242275597" w:history="1">
         <w:r>
           <w:rPr>
             <w:rStyle w:val="ad"/>
@@ -537,7 +537,7 @@
             <w:noProof/>
             <w:webHidden/>
           </w:rPr>
-          <w:instrText xml:space="preserve"> PAGEREF _Toc242215071 \h </w:instrText>
+          <w:instrText xml:space="preserve"> PAGEREF _Toc242275597 \h </w:instrText>
         </w:r>
         <w:r>
           <w:rPr>
@@ -583,7 +583,7 @@
           <w14:ligatures w14:val="standardContextual"/>
         </w:rPr>
       </w:pPr>
-      <w:hyperlink w:anchor="_Toc242215072" w:history="1">
+      <w:hyperlink w:anchor="_Toc242275598" w:history="1">
         <w:r>
           <w:rPr>
             <w:rStyle w:val="ad"/>
@@ -626,7 +626,7 @@
             <w:noProof/>
             <w:webHidden/>
           </w:rPr>
-          <w:instrText xml:space="preserve"> PAGEREF _Toc242215072 \h </w:instrText>
+          <w:instrText xml:space="preserve"> PAGEREF _Toc242275598 \h </w:instrText>
         </w:r>
         <w:r>
           <w:rPr>
@@ -672,7 +672,7 @@
           <w14:ligatures w14:val="standardContextual"/>
         </w:rPr>
       </w:pPr>
-      <w:hyperlink w:anchor="_Toc242215073" w:history="1">
+      <w:hyperlink w:anchor="_Toc242275599" w:history="1">
         <w:r>
           <w:rPr>
             <w:rStyle w:val="ad"/>
@@ -699,7 +699,7 @@
             <w:noProof/>
             <w:webHidden/>
           </w:rPr>
-          <w:instrText xml:space="preserve"> PAGEREF _Toc242215073 \h </w:instrText>
+          <w:instrText xml:space="preserve"> PAGEREF _Toc242275599 \h </w:instrText>
         </w:r>
         <w:r>
           <w:rPr>
@@ -745,7 +745,7 @@
           <w14:ligatures w14:val="standardContextual"/>
         </w:rPr>
       </w:pPr>
-      <w:hyperlink w:anchor="_Toc242215074" w:history="1">
+      <w:hyperlink w:anchor="_Toc242275600" w:history="1">
         <w:r>
           <w:rPr>
             <w:rStyle w:val="ad"/>
@@ -772,80 +772,7 @@
             <w:noProof/>
             <w:webHidden/>
           </w:rPr>
-          <w:instrText xml:space="preserve"> PAGEREF _Toc242215074 \h </w:instrText>
-        </w:r>
-        <w:r>
-          <w:rPr>
-            <w:noProof/>
-            <w:webHidden/>
-          </w:rPr>
-        </w:r>
-        <w:r>
-          <w:rPr>
-            <w:noProof/>
-            <w:webHidden/>
-          </w:rPr>
-          <w:fldChar w:fldCharType="separate"/>
-        </w:r>
-        <w:r>
-          <w:rPr>
-            <w:noProof/>
-            <w:webHidden/>
-          </w:rPr>
-          <w:t>18</w:t>
-        </w:r>
-        <w:r>
-          <w:rPr>
-            <w:noProof/>
-            <w:webHidden/>
-          </w:rPr>
-          <w:fldChar w:fldCharType="end"/>
-        </w:r>
-      </w:hyperlink>
-    </w:p>
-    <w:p>
-      <w:pPr>
-        <w:pStyle w:val="10"/>
-        <w:tabs>
-          <w:tab w:val="right" w:leader="dot" w:pos="9345"/>
-        </w:tabs>
-        <w:rPr>
-          <w:rFonts w:asciiTheme="minorHAnsi" w:eastAsiaTheme="minorEastAsia" w:hAnsiTheme="minorHAnsi" w:cstheme="minorBidi"/>
-          <w:noProof/>
-          <w:color w:val="auto"/>
-          <w:kern w:val="2"/>
-          <w:sz w:val="24"/>
-          <w14:ligatures w14:val="standardContextual"/>
-        </w:rPr>
-      </w:pPr>
-      <w:hyperlink w:anchor="_Toc242215075" w:history="1">
-        <w:r>
-          <w:rPr>
-            <w:rStyle w:val="ad"/>
-            <w:noProof/>
-          </w:rPr>
-          <w:t>ВЫВОДЫ</w:t>
-        </w:r>
-        <w:r>
-          <w:rPr>
-            <w:noProof/>
-            <w:webHidden/>
-          </w:rPr>
-          <w:tab/>
-        </w:r>
-        <w:r>
-          <w:rPr>
-            <w:noProof/>
-            <w:webHidden/>
-          </w:rPr>
-          <w:fldChar w:fldCharType="begin"/>
-        </w:r>
-        <w:r>
-          <w:rPr>
-            <w:noProof/>
-            <w:webHidden/>
-          </w:rPr>
-          <w:instrText xml:space="preserve"> PAGEREF _Toc242215075 \h </w:instrText>
+          <w:instrText xml:space="preserve"> PAGEREF _Toc242275600 \h </w:instrText>
         </w:r>
         <w:r>
           <w:rPr>
@@ -891,13 +818,13 @@
           <w14:ligatures w14:val="standardContextual"/>
         </w:rPr>
       </w:pPr>
-      <w:hyperlink w:anchor="_Toc242215076" w:history="1">
+      <w:hyperlink w:anchor="_Toc242275601" w:history="1">
         <w:r>
           <w:rPr>
             <w:rStyle w:val="ad"/>
             <w:noProof/>
           </w:rPr>
-          <w:t>СПИСОК ИСПОЛЬЗОВАННЫХ ИСТОЧНИКОВ</w:t>
+          <w:t>ВЫВОДЫ</w:t>
         </w:r>
         <w:r>
           <w:rPr>
@@ -918,7 +845,7 @@
             <w:noProof/>
             <w:webHidden/>
           </w:rPr>
-          <w:instrText xml:space="preserve"> PAGEREF _Toc242215076 \h </w:instrText>
+          <w:instrText xml:space="preserve"> PAGEREF _Toc242275601 \h </w:instrText>
         </w:r>
         <w:r>
           <w:rPr>
@@ -964,7 +891,80 @@
           <w14:ligatures w14:val="standardContextual"/>
         </w:rPr>
       </w:pPr>
-      <w:hyperlink w:anchor="_Toc242215077" w:history="1">
+      <w:hyperlink w:anchor="_Toc242275602" w:history="1">
+        <w:r>
+          <w:rPr>
+            <w:rStyle w:val="ad"/>
+            <w:noProof/>
+          </w:rPr>
+          <w:t>СПИСОК ИСПОЛЬЗОВАННЫХ ИСТОЧНИКОВ</w:t>
+        </w:r>
+        <w:r>
+          <w:rPr>
+            <w:noProof/>
+            <w:webHidden/>
+          </w:rPr>
+          <w:tab/>
+        </w:r>
+        <w:r>
+          <w:rPr>
+            <w:noProof/>
+            <w:webHidden/>
+          </w:rPr>
+          <w:fldChar w:fldCharType="begin"/>
+        </w:r>
+        <w:r>
+          <w:rPr>
+            <w:noProof/>
+            <w:webHidden/>
+          </w:rPr>
+          <w:instrText xml:space="preserve"> PAGEREF _Toc242275602 \h </w:instrText>
+        </w:r>
+        <w:r>
+          <w:rPr>
+            <w:noProof/>
+            <w:webHidden/>
+          </w:rPr>
+        </w:r>
+        <w:r>
+          <w:rPr>
+            <w:noProof/>
+            <w:webHidden/>
+          </w:rPr>
+          <w:fldChar w:fldCharType="separate"/>
+        </w:r>
+        <w:r>
+          <w:rPr>
+            <w:noProof/>
+            <w:webHidden/>
+          </w:rPr>
+          <w:t>21</w:t>
+        </w:r>
+        <w:r>
+          <w:rPr>
+            <w:noProof/>
+            <w:webHidden/>
+          </w:rPr>
+          <w:fldChar w:fldCharType="end"/>
+        </w:r>
+      </w:hyperlink>
+    </w:p>
+    <w:p>
+      <w:pPr>
+        <w:pStyle w:val="10"/>
+        <w:tabs>
+          <w:tab w:val="right" w:leader="dot" w:pos="9345"/>
+        </w:tabs>
+        <w:rPr>
+          <w:rFonts w:asciiTheme="minorHAnsi" w:eastAsiaTheme="minorEastAsia" w:hAnsiTheme="minorHAnsi" w:cstheme="minorBidi"/>
+          <w:noProof/>
+          <w:color w:val="auto"/>
+          <w:kern w:val="2"/>
+          <w:sz w:val="24"/>
+          <w14:ligatures w14:val="standardContextual"/>
+        </w:rPr>
+      </w:pPr>
+      <w:hyperlink w:anchor="_Toc242275603" w:history="1">
         <w:r>
           <w:rPr>
             <w:rStyle w:val="ad"/>
@@ -991,80 +991,7 @@
             <w:noProof/>
             <w:webHidden/>
           </w:rPr>
-          <w:instrText xml:space="preserve"> PAGEREF _Toc242215077 \h </w:instrText>
-        </w:r>
-        <w:r>
-          <w:rPr>
-            <w:noProof/>
-            <w:webHidden/>
-          </w:rPr>
-        </w:r>
-        <w:r>
-          <w:rPr>
-            <w:noProof/>
-            <w:webHidden/>
-          </w:rPr>
-          <w:fldChar w:fldCharType="separate"/>
-        </w:r>
-        <w:r>
-          <w:rPr>
-            <w:noProof/>
-            <w:webHidden/>
-          </w:rPr>
-          <w:t>22</w:t>
-        </w:r>
-        <w:r>
-          <w:rPr>
-            <w:noProof/>
-            <w:webHidden/>
-          </w:rPr>
-          <w:fldChar w:fldCharType="end"/>
-        </w:r>
-      </w:hyperlink>
-    </w:p>
-    <w:p>
-      <w:pPr>
-        <w:pStyle w:val="10"/>
-        <w:tabs>
-          <w:tab w:val="right" w:leader="dot" w:pos="9345"/>
-        </w:tabs>
-        <w:rPr>
-          <w:rFonts w:asciiTheme="minorHAnsi" w:eastAsiaTheme="minorEastAsia" w:hAnsiTheme="minorHAnsi" w:cstheme="minorBidi"/>
-          <w:noProof/>
-          <w:color w:val="auto"/>
-          <w:kern w:val="2"/>
-          <w:sz w:val="24"/>
-          <w14:ligatures w14:val="standardContextual"/>
-        </w:rPr>
-      </w:pPr>
-      <w:hyperlink w:anchor="_Toc242215078" w:history="1">
-        <w:r>
-          <w:rPr>
-            <w:rStyle w:val="ad"/>
-            <w:noProof/>
-          </w:rPr>
-          <w:t>ПРИЛОЖЕНИЕ Б</w:t>
-        </w:r>
-        <w:r>
-          <w:rPr>
-            <w:noProof/>
-            <w:webHidden/>
-          </w:rPr>
-          <w:tab/>
-        </w:r>
-        <w:r>
-          <w:rPr>
-            <w:noProof/>
-            <w:webHidden/>
-          </w:rPr>
-          <w:fldChar w:fldCharType="begin"/>
-        </w:r>
-        <w:r>
-          <w:rPr>
-            <w:noProof/>
-            <w:webHidden/>
-          </w:rPr>
-          <w:instrText xml:space="preserve"> PAGEREF _Toc242215078 \h </w:instrText>
+          <w:instrText xml:space="preserve"> PAGEREF _Toc242275603 \h </w:instrText>
         </w:r>
         <w:r>
           <w:rPr>
@@ -1110,13 +1037,13 @@
           <w14:ligatures w14:val="standardContextual"/>
         </w:rPr>
       </w:pPr>
-      <w:hyperlink w:anchor="_Toc242215079" w:history="1">
+      <w:hyperlink w:anchor="_Toc242275604" w:history="1">
         <w:r>
           <w:rPr>
             <w:rStyle w:val="ad"/>
             <w:noProof/>
           </w:rPr>
-          <w:t>ПРИЛОЖЕНИЕ В</w:t>
+          <w:t>ПРИЛОЖЕНИЕ Б</w:t>
         </w:r>
         <w:r>
           <w:rPr>
@@ -1137,7 +1064,7 @@
             <w:noProof/>
             <w:webHidden/>
           </w:rPr>
-          <w:instrText xml:space="preserve"> PAGEREF _Toc242215079 \h </w:instrText>
+          <w:instrText xml:space="preserve"> PAGEREF _Toc242275604 \h </w:instrText>
         </w:r>
         <w:r>
           <w:rPr>
@@ -1170,6 +1097,79 @@
     </w:p>
     <w:p>
       <w:pPr>
+        <w:pStyle w:val="10"/>
+        <w:tabs>
+          <w:tab w:val="right" w:leader="dot" w:pos="9345"/>
+        </w:tabs>
+        <w:rPr>
+          <w:rFonts w:asciiTheme="minorHAnsi" w:eastAsiaTheme="minorEastAsia" w:hAnsiTheme="minorHAnsi" w:cstheme="minorBidi"/>
+          <w:noProof/>
+          <w:color w:val="auto"/>
+          <w:kern w:val="2"/>
+          <w:sz w:val="24"/>
+          <w14:ligatures w14:val="standardContextual"/>
+        </w:rPr>
+      </w:pPr>
+      <w:hyperlink w:anchor="_Toc242275605" w:history="1">
+        <w:r>
+          <w:rPr>
+            <w:rStyle w:val="ad"/>
+            <w:noProof/>
+          </w:rPr>
+          <w:t>ПРИЛОЖЕНИЕ В</w:t>
+        </w:r>
+        <w:r>
+          <w:rPr>
+            <w:noProof/>
+            <w:webHidden/>
+          </w:rPr>
+          <w:tab/>
+        </w:r>
+        <w:r>
+          <w:rPr>
+            <w:noProof/>
+            <w:webHidden/>
+          </w:rPr>
+          <w:fldChar w:fldCharType="begin"/>
+        </w:r>
+        <w:r>
+          <w:rPr>
+            <w:noProof/>
+            <w:webHidden/>
+          </w:rPr>
+          <w:instrText xml:space="preserve"> PAGEREF _Toc242275605 \h </w:instrText>
+        </w:r>
+        <w:r>
+          <w:rPr>
+            <w:noProof/>
+            <w:webHidden/>
+          </w:rPr>
+        </w:r>
+        <w:r>
+          <w:rPr>
+            <w:noProof/>
+            <w:webHidden/>
+          </w:rPr>
+          <w:fldChar w:fldCharType="separate"/>
+        </w:r>
+        <w:r>
+          <w:rPr>
+            <w:noProof/>
+            <w:webHidden/>
+          </w:rPr>
+          <w:t>25</w:t>
+        </w:r>
+        <w:r>
+          <w:rPr>
+            <w:noProof/>
+            <w:webHidden/>
+          </w:rPr>
+          <w:fldChar w:fldCharType="end"/>
+        </w:r>
+      </w:hyperlink>
+    </w:p>
+    <w:p>
+      <w:pPr>
         <w:pStyle w:val="11"/>
       </w:pPr>
       <w:r>
@@ -1184,7 +1184,7 @@
         <w:ind w:firstLine="709"/>
         <w:jc w:val="left"/>
       </w:pPr>
-      <w:bookmarkStart w:id="1" w:name="_Toc242215067"/>
+      <w:bookmarkStart w:id="1" w:name="_Toc242275593"/>
       <w:r>
         <w:lastRenderedPageBreak/>
         <w:t>1 ЦЕЛЬ РАБОТЫ</w:t>
@@ -1382,7 +1382,7 @@
         <w:jc w:val="left"/>
       </w:pPr>
       <w:bookmarkStart w:id="2" w:name="ход-работы"/>
-      <w:bookmarkStart w:id="3" w:name="_Toc242215068"/>
+      <w:bookmarkStart w:id="3" w:name="_Toc242275594"/>
       <w:bookmarkEnd w:id="0"/>
       <w:r>
         <w:lastRenderedPageBreak/>
@@ -1398,7 +1398,7 @@
         <w:jc w:val="left"/>
       </w:pPr>
       <w:bookmarkStart w:id="4" w:name="исходные-материалы-и-порядок-работы"/>
-      <w:bookmarkStart w:id="5" w:name="_Toc242215069"/>
+      <w:bookmarkStart w:id="5" w:name="_Toc242275595"/>
       <w:r>
         <w:t>2.1 Исходные материалы и порядок работы</w:t>
       </w:r>
@@ -1884,7 +1884,7 @@
         <w:jc w:val="left"/>
       </w:pPr>
       <w:bookmarkStart w:id="6" w:name="X93d29a5782a4517557fff9d6ebfc303d927dc5a"/>
-      <w:bookmarkStart w:id="7" w:name="_Toc242215070"/>
+      <w:bookmarkStart w:id="7" w:name="_Toc242275596"/>
       <w:bookmarkEnd w:id="4"/>
       <w:r>
         <w:lastRenderedPageBreak/>
@@ -2448,7 +2448,7 @@
         <w:jc w:val="both"/>
       </w:pPr>
       <w:r>
-        <w:t>В таблице 2 приведено: описание объекта анализа.</w:t>
+        <w:t>Данные по теме «описание объекта анализа» приведены в таблице 2.</w:t>
       </w:r>
     </w:p>
     <w:p>
@@ -3402,7 +3402,7 @@
         <w:jc w:val="both"/>
       </w:pPr>
       <w:r>
-        <w:t>На рисунке 1 показано: карта конкурентной близости.</w:t>
+        <w:t>Рисунок 1 иллюстрирует тему «карта конкурентной близости».</w:t>
       </w:r>
     </w:p>
     <w:p>
@@ -3496,7 +3496,7 @@
         <w:jc w:val="left"/>
       </w:pPr>
       <w:bookmarkStart w:id="12" w:name="X0896298018f4fcc355446c9f8279810908650e0"/>
-      <w:bookmarkStart w:id="13" w:name="_Toc242215071"/>
+      <w:bookmarkStart w:id="13" w:name="_Toc242275597"/>
       <w:bookmarkEnd w:id="6"/>
       <w:bookmarkEnd w:id="11"/>
       <w:r>
@@ -4948,7 +4948,7 @@
         <w:spacing w:before="360"/>
       </w:pPr>
       <w:r>
-        <w:t>В таблице 4 приведено: выборка конкурентов и модель монетизации.</w:t>
+        <w:t>Данные по теме «выборка конкурентов и модель монетизации» приведены в таблице 4.</w:t>
       </w:r>
     </w:p>
     <w:p>
@@ -4988,6 +4988,7 @@
         <w:t xml:space="preserve">Материалы_собранные/sajty_konkurentov_stranicy_2026-10-01.json); </w:t>
       </w:r>
       <w:r>
+        <w:lastRenderedPageBreak/>
         <w:t xml:space="preserve">страницы </w:t>
       </w:r>
       <w:r>
@@ -5015,11 +5016,7 @@
         <w:t>Chart</w:t>
       </w:r>
       <w:r>
-        <w:t xml:space="preserve">, недоступные автоматическому </w:t>
-      </w:r>
-      <w:r>
-        <w:lastRenderedPageBreak/>
-        <w:t xml:space="preserve">запросу, прочитаны во встроенном браузере. Достоверность 5 присвоена страницам, прочитанным целиком (тарифы), и данным </w:t>
+        <w:t xml:space="preserve">, недоступные автоматическому запросу, прочитаны во встроенном браузере. Достоверность 5 присвоена страницам, прочитанным целиком (тарифы), и данным </w:t>
       </w:r>
       <w:r>
         <w:rPr>
@@ -5784,7 +5781,7 @@
         <w:spacing w:before="360"/>
       </w:pPr>
       <w:r>
-        <w:t>В таблице 5 приведено: число записей карты сайтов по конкурентам.</w:t>
+        <w:t>Данные по теме «число записей карты сайтов по конкурентам» приведены в таблице 5.</w:t>
       </w:r>
     </w:p>
     <w:p>
@@ -6312,7 +6309,7 @@
         <w:spacing w:before="360"/>
       </w:pPr>
       <w:r>
-        <w:t>В таблице 6 приведено: число признаков по уровням Левитта.</w:t>
+        <w:t>Данные по теме «число признаков по уровням Левитта» приведены в таблице 6.</w:t>
       </w:r>
     </w:p>
     <w:p>
@@ -6325,6 +6322,7 @@
       <w:bookmarkStart w:id="17" w:name="требования-по-кано-и-рыночный-стандарт"/>
       <w:bookmarkEnd w:id="16"/>
       <w:r>
+        <w:lastRenderedPageBreak/>
         <w:t>2.3.4 Требования по Кано и рыночный стандарт</w:t>
       </w:r>
     </w:p>
@@ -6351,11 +6349,7 @@
         <w:t>IDEF0</w:t>
       </w:r>
       <w:r>
-        <w:t xml:space="preserve"> </w:t>
-      </w:r>
-      <w:r>
-        <w:lastRenderedPageBreak/>
-        <w:t xml:space="preserve">и </w:t>
+        <w:t xml:space="preserve"> и </w:t>
       </w:r>
       <w:r>
         <w:rPr>
@@ -8197,244 +8191,6 @@
           </w:p>
         </w:tc>
       </w:tr>
-      <w:tr>
-        <w:trPr>
-          <w:cantSplit/>
-          <w:jc w:val="center"/>
-        </w:trPr>
-        <w:tc>
-          <w:tcPr>
-            <w:tcW w:w="2541" w:type="dxa"/>
-            <w:vAlign w:val="center"/>
-          </w:tcPr>
-          <w:p>
-            <w:pPr>
-              <w:pStyle w:val="Compact"/>
-              <w:spacing w:line="240" w:lineRule="auto"/>
-              <w:ind w:firstLine="0"/>
-              <w:jc w:val="center"/>
-            </w:pPr>
-            <w:r>
-              <w:rPr>
-                <w:sz w:val="24"/>
-              </w:rPr>
-              <w:t>История версий</w:t>
-            </w:r>
-          </w:p>
-        </w:tc>
-        <w:tc>
-          <w:tcPr>
-            <w:tcW w:w="1690" w:type="dxa"/>
-            <w:vAlign w:val="center"/>
-          </w:tcPr>
-          <w:p>
-            <w:pPr>
-              <w:pStyle w:val="Compact"/>
-              <w:spacing w:line="240" w:lineRule="auto"/>
-              <w:ind w:firstLine="0"/>
-              <w:jc w:val="center"/>
-            </w:pPr>
-            <w:r>
-              <w:rPr>
-                <w:sz w:val="24"/>
-              </w:rPr>
-              <w:t>5</w:t>
-            </w:r>
-          </w:p>
-        </w:tc>
-        <w:tc>
-          <w:tcPr>
-            <w:tcW w:w="726" w:type="dxa"/>
-            <w:vAlign w:val="center"/>
-          </w:tcPr>
-          <w:p>
-            <w:pPr>
-              <w:pStyle w:val="Compact"/>
-              <w:spacing w:line="240" w:lineRule="auto"/>
-              <w:ind w:firstLine="0"/>
-              <w:jc w:val="center"/>
-            </w:pPr>
-            <w:r>
-              <w:rPr>
-                <w:sz w:val="24"/>
-              </w:rPr>
-              <w:t>0,62</w:t>
-            </w:r>
-          </w:p>
-        </w:tc>
-        <w:tc>
-          <w:tcPr>
-            <w:tcW w:w="2298" w:type="dxa"/>
-            <w:vAlign w:val="center"/>
-          </w:tcPr>
-          <w:p>
-            <w:pPr>
-              <w:pStyle w:val="Compact"/>
-              <w:spacing w:line="240" w:lineRule="auto"/>
-              <w:ind w:firstLine="0"/>
-              <w:jc w:val="center"/>
-            </w:pPr>
-            <w:r>
-              <w:rPr>
-                <w:sz w:val="24"/>
-              </w:rPr>
-              <w:t>Линейное</w:t>
-            </w:r>
-          </w:p>
-        </w:tc>
-        <w:tc>
-          <w:tcPr>
-            <w:tcW w:w="2100" w:type="dxa"/>
-            <w:vAlign w:val="center"/>
-          </w:tcPr>
-          <w:p>
-            <w:pPr>
-              <w:pStyle w:val="Compact"/>
-              <w:spacing w:line="240" w:lineRule="auto"/>
-              <w:ind w:firstLine="0"/>
-              <w:jc w:val="center"/>
-            </w:pPr>
-            <w:r>
-              <w:rPr>
-                <w:sz w:val="24"/>
-              </w:rPr>
-              <w:t>Рыночный стандарт</w:t>
-            </w:r>
-          </w:p>
-        </w:tc>
-      </w:tr>
-      <w:tr>
-        <w:trPr>
-          <w:cantSplit/>
-          <w:jc w:val="center"/>
-        </w:trPr>
-        <w:tc>
-          <w:tcPr>
-            <w:tcW w:w="2541" w:type="dxa"/>
-            <w:vAlign w:val="center"/>
-          </w:tcPr>
-          <w:p>
-            <w:pPr>
-              <w:pStyle w:val="Compact"/>
-              <w:spacing w:line="240" w:lineRule="auto"/>
-              <w:ind w:firstLine="0"/>
-              <w:jc w:val="center"/>
-            </w:pPr>
-            <w:r>
-              <w:rPr>
-                <w:sz w:val="24"/>
-              </w:rPr>
-              <w:t>Корпоративный тариф (</w:t>
-            </w:r>
-            <w:r>
-              <w:rPr>
-                <w:i/>
-                <w:sz w:val="24"/>
-              </w:rPr>
-              <w:t>Enterprise</w:t>
-            </w:r>
-            <w:r>
-              <w:rPr>
-                <w:sz w:val="24"/>
-              </w:rPr>
-              <w:t xml:space="preserve"> или </w:t>
-            </w:r>
-            <w:r>
-              <w:rPr>
-                <w:i/>
-                <w:sz w:val="24"/>
-              </w:rPr>
-              <w:t>on-prem</w:t>
-            </w:r>
-            <w:r>
-              <w:rPr>
-                <w:sz w:val="24"/>
-              </w:rPr>
-              <w:t>)</w:t>
-            </w:r>
-          </w:p>
-        </w:tc>
-        <w:tc>
-          <w:tcPr>
-            <w:tcW w:w="1690" w:type="dxa"/>
-            <w:vAlign w:val="center"/>
-          </w:tcPr>
-          <w:p>
-            <w:pPr>
-              <w:pStyle w:val="Compact"/>
-              <w:spacing w:line="240" w:lineRule="auto"/>
-              <w:ind w:firstLine="0"/>
-              <w:jc w:val="center"/>
-            </w:pPr>
-            <w:r>
-              <w:rPr>
-                <w:sz w:val="24"/>
-              </w:rPr>
-              <w:t>4</w:t>
-            </w:r>
-          </w:p>
-        </w:tc>
-        <w:tc>
-          <w:tcPr>
-            <w:tcW w:w="726" w:type="dxa"/>
-            <w:vAlign w:val="center"/>
-          </w:tcPr>
-          <w:p>
-            <w:pPr>
-              <w:pStyle w:val="Compact"/>
-              <w:spacing w:line="240" w:lineRule="auto"/>
-              <w:ind w:firstLine="0"/>
-              <w:jc w:val="center"/>
-            </w:pPr>
-            <w:r>
-              <w:rPr>
-                <w:sz w:val="24"/>
-              </w:rPr>
-              <w:t>0,5</w:t>
-            </w:r>
-          </w:p>
-        </w:tc>
-        <w:tc>
-          <w:tcPr>
-            <w:tcW w:w="2298" w:type="dxa"/>
-            <w:vAlign w:val="center"/>
-          </w:tcPr>
-          <w:p>
-            <w:pPr>
-              <w:pStyle w:val="Compact"/>
-              <w:spacing w:line="240" w:lineRule="auto"/>
-              <w:ind w:firstLine="0"/>
-              <w:jc w:val="center"/>
-            </w:pPr>
-            <w:r>
-              <w:rPr>
-                <w:sz w:val="24"/>
-              </w:rPr>
-              <w:t>Безразличное</w:t>
-            </w:r>
-          </w:p>
-        </w:tc>
-        <w:tc>
-          <w:tcPr>
-            <w:tcW w:w="2100" w:type="dxa"/>
-            <w:vAlign w:val="center"/>
-          </w:tcPr>
-          <w:p>
-            <w:pPr>
-              <w:pStyle w:val="Compact"/>
-              <w:spacing w:line="240" w:lineRule="auto"/>
-              <w:ind w:firstLine="0"/>
-              <w:jc w:val="center"/>
-            </w:pPr>
-            <w:r>
-              <w:rPr>
-                <w:sz w:val="24"/>
-              </w:rPr>
-              <w:t>Низкий приоритет</w:t>
-            </w:r>
-          </w:p>
-        </w:tc>
-      </w:tr>
     </w:tbl>
     <w:p>
       <w:pPr>
@@ -8593,6 +8349,244 @@
                 <w:sz w:val="24"/>
               </w:rPr>
               <w:t>Статус</w:t>
+            </w:r>
+          </w:p>
+        </w:tc>
+      </w:tr>
+      <w:tr>
+        <w:trPr>
+          <w:cantSplit/>
+          <w:jc w:val="center"/>
+        </w:trPr>
+        <w:tc>
+          <w:tcPr>
+            <w:tcW w:w="2541" w:type="dxa"/>
+            <w:vAlign w:val="center"/>
+          </w:tcPr>
+          <w:p>
+            <w:pPr>
+              <w:pStyle w:val="Compact"/>
+              <w:spacing w:line="240" w:lineRule="auto"/>
+              <w:ind w:firstLine="0"/>
+              <w:jc w:val="center"/>
+            </w:pPr>
+            <w:r>
+              <w:rPr>
+                <w:sz w:val="24"/>
+              </w:rPr>
+              <w:t>История версий</w:t>
+            </w:r>
+          </w:p>
+        </w:tc>
+        <w:tc>
+          <w:tcPr>
+            <w:tcW w:w="1690" w:type="dxa"/>
+            <w:vAlign w:val="center"/>
+          </w:tcPr>
+          <w:p>
+            <w:pPr>
+              <w:pStyle w:val="Compact"/>
+              <w:spacing w:line="240" w:lineRule="auto"/>
+              <w:ind w:firstLine="0"/>
+              <w:jc w:val="center"/>
+            </w:pPr>
+            <w:r>
+              <w:rPr>
+                <w:sz w:val="24"/>
+              </w:rPr>
+              <w:t>5</w:t>
+            </w:r>
+          </w:p>
+        </w:tc>
+        <w:tc>
+          <w:tcPr>
+            <w:tcW w:w="726" w:type="dxa"/>
+            <w:vAlign w:val="center"/>
+          </w:tcPr>
+          <w:p>
+            <w:pPr>
+              <w:pStyle w:val="Compact"/>
+              <w:spacing w:line="240" w:lineRule="auto"/>
+              <w:ind w:firstLine="0"/>
+              <w:jc w:val="center"/>
+            </w:pPr>
+            <w:r>
+              <w:rPr>
+                <w:sz w:val="24"/>
+              </w:rPr>
+              <w:t>0,62</w:t>
+            </w:r>
+          </w:p>
+        </w:tc>
+        <w:tc>
+          <w:tcPr>
+            <w:tcW w:w="2298" w:type="dxa"/>
+            <w:vAlign w:val="center"/>
+          </w:tcPr>
+          <w:p>
+            <w:pPr>
+              <w:pStyle w:val="Compact"/>
+              <w:spacing w:line="240" w:lineRule="auto"/>
+              <w:ind w:firstLine="0"/>
+              <w:jc w:val="center"/>
+            </w:pPr>
+            <w:r>
+              <w:rPr>
+                <w:sz w:val="24"/>
+              </w:rPr>
+              <w:t>Линейное</w:t>
+            </w:r>
+          </w:p>
+        </w:tc>
+        <w:tc>
+          <w:tcPr>
+            <w:tcW w:w="2100" w:type="dxa"/>
+            <w:vAlign w:val="center"/>
+          </w:tcPr>
+          <w:p>
+            <w:pPr>
+              <w:pStyle w:val="Compact"/>
+              <w:spacing w:line="240" w:lineRule="auto"/>
+              <w:ind w:firstLine="0"/>
+              <w:jc w:val="center"/>
+            </w:pPr>
+            <w:r>
+              <w:rPr>
+                <w:sz w:val="24"/>
+              </w:rPr>
+              <w:t>Рыночный стандарт</w:t>
+            </w:r>
+          </w:p>
+        </w:tc>
+      </w:tr>
+      <w:tr>
+        <w:trPr>
+          <w:cantSplit/>
+          <w:jc w:val="center"/>
+        </w:trPr>
+        <w:tc>
+          <w:tcPr>
+            <w:tcW w:w="2541" w:type="dxa"/>
+            <w:vAlign w:val="center"/>
+          </w:tcPr>
+          <w:p>
+            <w:pPr>
+              <w:pStyle w:val="Compact"/>
+              <w:spacing w:line="240" w:lineRule="auto"/>
+              <w:ind w:firstLine="0"/>
+              <w:jc w:val="center"/>
+            </w:pPr>
+            <w:r>
+              <w:rPr>
+                <w:sz w:val="24"/>
+              </w:rPr>
+              <w:t>Корпоративный тариф (</w:t>
+            </w:r>
+            <w:r>
+              <w:rPr>
+                <w:i/>
+                <w:sz w:val="24"/>
+              </w:rPr>
+              <w:t>Enterprise</w:t>
+            </w:r>
+            <w:r>
+              <w:rPr>
+                <w:sz w:val="24"/>
+              </w:rPr>
+              <w:t xml:space="preserve"> или </w:t>
+            </w:r>
+            <w:r>
+              <w:rPr>
+                <w:i/>
+                <w:sz w:val="24"/>
+              </w:rPr>
+              <w:t>on-prem</w:t>
+            </w:r>
+            <w:r>
+              <w:rPr>
+                <w:sz w:val="24"/>
+              </w:rPr>
+              <w:t>)</w:t>
+            </w:r>
+          </w:p>
+        </w:tc>
+        <w:tc>
+          <w:tcPr>
+            <w:tcW w:w="1690" w:type="dxa"/>
+            <w:vAlign w:val="center"/>
+          </w:tcPr>
+          <w:p>
+            <w:pPr>
+              <w:pStyle w:val="Compact"/>
+              <w:spacing w:line="240" w:lineRule="auto"/>
+              <w:ind w:firstLine="0"/>
+              <w:jc w:val="center"/>
+            </w:pPr>
+            <w:r>
+              <w:rPr>
+                <w:sz w:val="24"/>
+              </w:rPr>
+              <w:t>4</w:t>
+            </w:r>
+          </w:p>
+        </w:tc>
+        <w:tc>
+          <w:tcPr>
+            <w:tcW w:w="726" w:type="dxa"/>
+            <w:vAlign w:val="center"/>
+          </w:tcPr>
+          <w:p>
+            <w:pPr>
+              <w:pStyle w:val="Compact"/>
+              <w:spacing w:line="240" w:lineRule="auto"/>
+              <w:ind w:firstLine="0"/>
+              <w:jc w:val="center"/>
+            </w:pPr>
+            <w:r>
+              <w:rPr>
+                <w:sz w:val="24"/>
+              </w:rPr>
+              <w:t>0,5</w:t>
+            </w:r>
+          </w:p>
+        </w:tc>
+        <w:tc>
+          <w:tcPr>
+            <w:tcW w:w="2298" w:type="dxa"/>
+            <w:vAlign w:val="center"/>
+          </w:tcPr>
+          <w:p>
+            <w:pPr>
+              <w:pStyle w:val="Compact"/>
+              <w:spacing w:line="240" w:lineRule="auto"/>
+              <w:ind w:firstLine="0"/>
+              <w:jc w:val="center"/>
+            </w:pPr>
+            <w:r>
+              <w:rPr>
+                <w:sz w:val="24"/>
+              </w:rPr>
+              <w:t>Безразличное</w:t>
+            </w:r>
+          </w:p>
+        </w:tc>
+        <w:tc>
+          <w:tcPr>
+            <w:tcW w:w="2100" w:type="dxa"/>
+            <w:vAlign w:val="center"/>
+          </w:tcPr>
+          <w:p>
+            <w:pPr>
+              <w:pStyle w:val="Compact"/>
+              <w:spacing w:line="240" w:lineRule="auto"/>
+              <w:ind w:firstLine="0"/>
+              <w:jc w:val="center"/>
+            </w:pPr>
+            <w:r>
+              <w:rPr>
+                <w:sz w:val="24"/>
+              </w:rPr>
+              <w:t>Низкий приоритет</w:t>
             </w:r>
           </w:p>
         </w:tc>
@@ -10062,7 +10056,7 @@
         <w:jc w:val="both"/>
       </w:pPr>
       <w:r>
-        <w:t>На рисунке 2 показано: доля конкурентов с признаком по категориям Кано.</w:t>
+        <w:t>Рисунок 2 иллюстрирует тему «доля конкурентов с признаком по категориям Кано».</w:t>
       </w:r>
     </w:p>
     <w:p>
@@ -10864,7 +10858,7 @@
         <w:spacing w:before="360"/>
       </w:pPr>
       <w:r>
-        <w:t>В таблице 8 приведено: итоговый взвешенный балл конкурентов по 25 критериям.</w:t>
+        <w:t>Данные по теме «итоговый взвешенный балл конкурентов по 25 критериям» приведены в таблице 8.</w:t>
       </w:r>
     </w:p>
     <w:p>
@@ -11884,7 +11878,7 @@
         <w:jc w:val="both"/>
       </w:pPr>
       <w:r>
-        <w:t>В таблице 9 приведено: конкурентные преимущества по товару.</w:t>
+        <w:t>Данные по теме «конкурентные преимущества по товару» приведены в таблице 9.</w:t>
       </w:r>
     </w:p>
     <w:p>
@@ -12051,7 +12045,7 @@
         <w:jc w:val="left"/>
       </w:pPr>
       <w:bookmarkStart w:id="20" w:name="X4253a8e12fd5158fd37918e6e474d634b541850"/>
-      <w:bookmarkStart w:id="21" w:name="_Toc242215072"/>
+      <w:bookmarkStart w:id="21" w:name="_Toc242275598"/>
       <w:bookmarkEnd w:id="12"/>
       <w:bookmarkEnd w:id="19"/>
       <w:r>
@@ -12090,6 +12084,7 @@
       </w:pPr>
       <w:bookmarkStart w:id="22" w:name="паспорт-исследования"/>
       <w:r>
+        <w:lastRenderedPageBreak/>
         <w:t>2.4.1 Паспорт исследования</w:t>
       </w:r>
     </w:p>
@@ -12107,11 +12102,7 @@
         <w:t>NotaCode</w:t>
       </w:r>
       <w:r>
-        <w:t xml:space="preserve">. Единица анализа – предложение </w:t>
-      </w:r>
-      <w:r>
-        <w:lastRenderedPageBreak/>
-        <w:t>конкурента на его сайте; рынок и период сбора – по ЛР4 и страницам 01.10.2026; конкуренты – 8 из таблицы 4.</w:t>
+        <w:t>. Единица анализа – предложение конкурента на его сайте; рынок и период сбора – по ЛР4 и страницам 01.10.2026; конкуренты – 8 из таблицы 4.</w:t>
       </w:r>
     </w:p>
     <w:p>
@@ -13272,7 +13263,7 @@
         <w:spacing w:before="360"/>
       </w:pPr>
       <w:r>
-        <w:t>В таблице 10 приведено: доказательность и итог матрицы бизнес-моделей.</w:t>
+        <w:t>Данные по теме «доказательность и итог матрицы бизнес-моделей» приведены в таблице 10.</w:t>
       </w:r>
     </w:p>
     <w:p>
@@ -13401,7 +13392,11 @@
         <w:t>у.е.</w:t>
       </w:r>
       <w:r>
-        <w:t xml:space="preserve"> (таблица 4). Прозрачность цены (1–5) выше у конкурентов с открытой страницей тарифов; гибкость модели – у </w:t>
+        <w:t xml:space="preserve"> (таблица 4). Прозрачность цены (1–5) выше у конкурентов с открытой </w:t>
+      </w:r>
+      <w:r>
+        <w:lastRenderedPageBreak/>
+        <w:t xml:space="preserve">страницей тарифов; гибкость модели – у </w:t>
       </w:r>
       <w:r>
         <w:rPr>
@@ -13432,7 +13427,6 @@
       <w:bookmarkStart w:id="25" w:name="каналы-и-воронка"/>
       <w:bookmarkEnd w:id="24"/>
       <w:r>
-        <w:lastRenderedPageBreak/>
         <w:t>2.4.4 Каналы и воронка</w:t>
       </w:r>
     </w:p>
@@ -15109,6 +15103,143 @@
           </w:p>
         </w:tc>
       </w:tr>
+    </w:tbl>
+    <w:p>
+      <w:pPr>
+        <w:keepNext/>
+        <w:spacing w:before="360"/>
+      </w:pPr>
+      <w:r>
+        <w:lastRenderedPageBreak/>
+        <w:t>Продолжение таблицы 11</w:t>
+      </w:r>
+    </w:p>
+    <w:tbl>
+      <w:tblPr>
+        <w:tblStyle w:val="Table"/>
+        <w:tblW w:w="9355" w:type="dxa"/>
+        <w:jc w:val="center"/>
+        <w:tblBorders>
+          <w:top w:val="single" w:sz="4" w:space="0" w:color="000000"/>
+          <w:left w:val="single" w:sz="4" w:space="0" w:color="000000"/>
+          <w:bottom w:val="single" w:sz="4" w:space="0" w:color="000000"/>
+          <w:right w:val="single" w:sz="4" w:space="0" w:color="000000"/>
+          <w:insideH w:val="single" w:sz="4" w:space="0" w:color="000000"/>
+          <w:insideV w:val="single" w:sz="4" w:space="0" w:color="000000"/>
+        </w:tblBorders>
+        <w:tblLayout w:type="fixed"/>
+        <w:tblLook w:val="0020" w:firstRow="1" w:lastRow="0" w:firstColumn="0" w:lastColumn="0" w:noHBand="0" w:noVBand="0"/>
+      </w:tblPr>
+      <w:tblGrid>
+        <w:gridCol w:w="3930"/>
+        <w:gridCol w:w="2032"/>
+        <w:gridCol w:w="726"/>
+        <w:gridCol w:w="2667"/>
+      </w:tblGrid>
+      <w:tr>
+        <w:trPr>
+          <w:cnfStyle w:val="100000000000" w:firstRow="1" w:lastRow="0" w:firstColumn="0" w:lastColumn="0" w:oddVBand="0" w:evenVBand="0" w:oddHBand="0" w:evenHBand="0" w:firstRowFirstColumn="0" w:firstRowLastColumn="0" w:lastRowFirstColumn="0" w:lastRowLastColumn="0"/>
+          <w:cantSplit/>
+          <w:tblHeader/>
+          <w:jc w:val="center"/>
+        </w:trPr>
+        <w:tc>
+          <w:tcPr>
+            <w:tcW w:w="3930" w:type="dxa"/>
+            <w:vAlign w:val="center"/>
+          </w:tcPr>
+          <w:p>
+            <w:pPr>
+              <w:pStyle w:val="Compact"/>
+              <w:keepNext/>
+              <w:spacing w:line="240" w:lineRule="auto"/>
+              <w:ind w:firstLine="0"/>
+              <w:jc w:val="center"/>
+              <w:rPr>
+                <w:sz w:val="24"/>
+              </w:rPr>
+            </w:pPr>
+            <w:r>
+              <w:rPr>
+                <w:sz w:val="24"/>
+              </w:rPr>
+              <w:t>Практика</w:t>
+            </w:r>
+          </w:p>
+        </w:tc>
+        <w:tc>
+          <w:tcPr>
+            <w:tcW w:w="2032" w:type="dxa"/>
+            <w:vAlign w:val="center"/>
+          </w:tcPr>
+          <w:p>
+            <w:pPr>
+              <w:pStyle w:val="Compact"/>
+              <w:keepNext/>
+              <w:spacing w:line="240" w:lineRule="auto"/>
+              <w:ind w:firstLine="0"/>
+              <w:jc w:val="center"/>
+              <w:rPr>
+                <w:sz w:val="24"/>
+              </w:rPr>
+            </w:pPr>
+            <w:r>
+              <w:rPr>
+                <w:sz w:val="24"/>
+              </w:rPr>
+              <w:t>Конкурентов из 8</w:t>
+            </w:r>
+          </w:p>
+        </w:tc>
+        <w:tc>
+          <w:tcPr>
+            <w:tcW w:w="726" w:type="dxa"/>
+            <w:vAlign w:val="center"/>
+          </w:tcPr>
+          <w:p>
+            <w:pPr>
+              <w:pStyle w:val="Compact"/>
+              <w:keepNext/>
+              <w:spacing w:line="240" w:lineRule="auto"/>
+              <w:ind w:firstLine="0"/>
+              <w:jc w:val="center"/>
+              <w:rPr>
+                <w:sz w:val="24"/>
+              </w:rPr>
+            </w:pPr>
+            <w:r>
+              <w:rPr>
+                <w:sz w:val="24"/>
+              </w:rPr>
+              <w:t>Доля</w:t>
+            </w:r>
+          </w:p>
+        </w:tc>
+        <w:tc>
+          <w:tcPr>
+            <w:tcW w:w="2667" w:type="dxa"/>
+            <w:vAlign w:val="center"/>
+          </w:tcPr>
+          <w:p>
+            <w:pPr>
+              <w:pStyle w:val="Compact"/>
+              <w:keepNext/>
+              <w:spacing w:line="240" w:lineRule="auto"/>
+              <w:ind w:firstLine="0"/>
+              <w:jc w:val="center"/>
+              <w:rPr>
+                <w:sz w:val="24"/>
+              </w:rPr>
+            </w:pPr>
+            <w:r>
+              <w:rPr>
+                <w:sz w:val="24"/>
+              </w:rPr>
+              <w:t>Статус по шаблону</w:t>
+            </w:r>
+          </w:p>
+        </w:tc>
+      </w:tr>
       <w:tr>
         <w:trPr>
           <w:cantSplit/>
@@ -15376,7 +15507,6 @@
         <w:jc w:val="both"/>
       </w:pPr>
       <w:r>
-        <w:lastRenderedPageBreak/>
         <w:t xml:space="preserve">Рыночный стандарт – 5 практик, формирующийся стандарт – 11, зона дифференциации – 1, слабый сигнал – 2. Рейтинг по итогу матрицы с учетом надежности: </w:t>
       </w:r>
       <w:r>
@@ -15551,7 +15681,7 @@
         <w:jc w:val="left"/>
       </w:pPr>
       <w:bookmarkStart w:id="28" w:name="исправления-рабочих-копий-шаблонов"/>
-      <w:bookmarkStart w:id="29" w:name="_Toc242215073"/>
+      <w:bookmarkStart w:id="29" w:name="_Toc242275599"/>
       <w:bookmarkEnd w:id="20"/>
       <w:bookmarkEnd w:id="27"/>
       <w:r>
@@ -16493,6 +16623,7 @@
         <w:jc w:val="both"/>
       </w:pPr>
       <w:r>
+        <w:lastRenderedPageBreak/>
         <w:t>Полный перечень – на листах журналов рабочих книг.</w:t>
       </w:r>
     </w:p>
@@ -16505,7 +16636,7 @@
         <w:jc w:val="left"/>
       </w:pPr>
       <w:bookmarkStart w:id="30" w:name="проверка-по-критериям-методики"/>
-      <w:bookmarkStart w:id="31" w:name="_Toc242215074"/>
+      <w:bookmarkStart w:id="31" w:name="_Toc242275600"/>
       <w:bookmarkEnd w:id="2"/>
       <w:bookmarkEnd w:id="28"/>
       <w:r>
@@ -17688,7 +17819,7 @@
         <w:spacing w:before="360"/>
       </w:pPr>
       <w:r>
-        <w:t>В таблице 13 приведено: контрольный перечень результатов.</w:t>
+        <w:t>Данные по теме «контрольный перечень результатов» приведены в таблице 13.</w:t>
       </w:r>
     </w:p>
     <w:p>
@@ -17698,7 +17829,7 @@
         <w:spacing w:before="360" w:after="360"/>
       </w:pPr>
       <w:bookmarkStart w:id="32" w:name="выводы"/>
-      <w:bookmarkStart w:id="33" w:name="_Toc242215075"/>
+      <w:bookmarkStart w:id="33" w:name="_Toc242275601"/>
       <w:bookmarkEnd w:id="30"/>
       <w:r>
         <w:lastRenderedPageBreak/>
@@ -18028,7 +18159,7 @@
         <w:spacing w:after="360"/>
       </w:pPr>
       <w:bookmarkStart w:id="34" w:name="список-использованных-источников"/>
-      <w:bookmarkStart w:id="35" w:name="_Toc242215076"/>
+      <w:bookmarkStart w:id="35" w:name="_Toc242275602"/>
       <w:bookmarkEnd w:id="32"/>
       <w:r>
         <w:lastRenderedPageBreak/>
@@ -18206,7 +18337,7 @@
         <w:spacing w:after="360"/>
       </w:pPr>
       <w:bookmarkStart w:id="36" w:name="X0d652d9c320698e7c8068993b30a2dd7ee59c14"/>
-      <w:bookmarkStart w:id="37" w:name="_Toc242215077"/>
+      <w:bookmarkStart w:id="37" w:name="_Toc242275603"/>
       <w:bookmarkEnd w:id="34"/>
       <w:r>
         <w:lastRenderedPageBreak/>
@@ -18216,8 +18347,8 @@
     </w:p>
     <w:p>
       <w:pPr>
-        <w:ind w:firstLine="709"/>
-        <w:jc w:val="both"/>
+        <w:keepNext/>
+        <w:jc w:val="center"/>
       </w:pPr>
       <w:r>
         <w:t>(обязательное)</w:t>
@@ -18225,8 +18356,8 @@
     </w:p>
     <w:p>
       <w:pPr>
-        <w:ind w:firstLine="709"/>
-        <w:jc w:val="both"/>
+        <w:keepNext/>
+        <w:jc w:val="center"/>
       </w:pPr>
       <w:r>
         <w:rPr>
@@ -18799,7 +18930,7 @@
         <w:rPr>
           <w:i/>
         </w:rPr>
-        <w:t>В таблице 14 приведено: файлы лабораторной работы.</w:t>
+        <w:t>Данные по теме «файлы лабораторной работы» приведены в таблице 14.</w:t>
       </w:r>
     </w:p>
     <w:p>
@@ -18809,7 +18940,7 @@
         <w:spacing w:before="360" w:after="360"/>
       </w:pPr>
       <w:bookmarkStart w:id="38" w:name="Xe57dfa954bc99fa1a56051ea98d15e9969e72a7"/>
-      <w:bookmarkStart w:id="39" w:name="_Toc242215078"/>
+      <w:bookmarkStart w:id="39" w:name="_Toc242275604"/>
       <w:bookmarkEnd w:id="36"/>
       <w:r>
         <w:lastRenderedPageBreak/>
@@ -18819,8 +18950,8 @@
     </w:p>
     <w:p>
       <w:pPr>
-        <w:ind w:firstLine="709"/>
-        <w:jc w:val="both"/>
+        <w:keepNext/>
+        <w:jc w:val="center"/>
       </w:pPr>
       <w:r>
         <w:t>(обязательное)</w:t>
@@ -18828,8 +18959,8 @@
     </w:p>
     <w:p>
       <w:pPr>
-        <w:ind w:firstLine="709"/>
-        <w:jc w:val="both"/>
+        <w:keepNext/>
+        <w:jc w:val="center"/>
       </w:pPr>
       <w:r>
         <w:rPr>
@@ -19917,7 +20048,7 @@
         <w:rPr>
           <w:i/>
         </w:rPr>
-        <w:t>В таблице 15 приведено: перечень данных, требующих дополнительного сбора.</w:t>
+        <w:t>Данные по теме «перечень данных, требующих дополнительного сбора» приведены в таблице 15.</w:t>
       </w:r>
     </w:p>
     <w:p>
@@ -19927,7 +20058,7 @@
         <w:spacing w:before="360" w:after="360"/>
       </w:pPr>
       <w:bookmarkStart w:id="40" w:name="X5524ab9f965042c4d6511d6315044a9f4f6816c"/>
-      <w:bookmarkStart w:id="41" w:name="_Toc242215079"/>
+      <w:bookmarkStart w:id="41" w:name="_Toc242275605"/>
       <w:bookmarkEnd w:id="38"/>
       <w:r>
         <w:lastRenderedPageBreak/>
@@ -19937,8 +20068,8 @@
     </w:p>
     <w:p>
       <w:pPr>
-        <w:ind w:firstLine="709"/>
-        <w:jc w:val="both"/>
+        <w:keepNext/>
+        <w:jc w:val="center"/>
       </w:pPr>
       <w:r>
         <w:t>(обязательное)</w:t>
@@ -19946,8 +20077,8 @@
     </w:p>
     <w:p>
       <w:pPr>
-        <w:ind w:firstLine="709"/>
-        <w:jc w:val="both"/>
+        <w:keepNext/>
+        <w:jc w:val="center"/>
       </w:pPr>
       <w:r>
         <w:rPr>
@@ -20579,7 +20710,7 @@
         <w:spacing w:before="360"/>
       </w:pPr>
       <w:r>
-        <w:t>В таблице 16 приведено: новые данные о конкурентах.</w:t>
+        <w:t>Данные по теме «новые данные о конкурентах» приведены в таблице 16.</w:t>
       </w:r>
     </w:p>
     <w:p>
@@ -21082,7 +21213,7 @@
         <w:spacing w:before="360"/>
       </w:pPr>
       <w:r>
-        <w:t>В таблице 17 приведено: темы жалоб пользователей по отзывам Trustpilot (49 записей, пять продуктов).</w:t>
+        <w:t>Данные по теме «темы жалоб пользователей по отзывам Trustpilot (49 записей, пять продуктов)» приведены в таблице 17.</w:t>
       </w:r>
     </w:p>
     <w:p>

</xml_diff>

<commit_message>
feat: lists numbered as plain numbers, sources as [1] in the VAK RB form, build instruction and author paragraphs for the reports
</commit_message>
<xml_diff>
--- a/ПРОВЕРИТЬ_ОТЧЕТЫ/ОТЧЕТ_ЛР5_NotaCode.docx
+++ b/ПРОВЕРИТЬ_ОТЧЕТЫ/ОТЧЕТ_ЛР5_NotaCode.docx
@@ -186,7 +186,7 @@
       <w:r>
         <w:fldChar w:fldCharType="separate"/>
       </w:r>
-      <w:hyperlink w:anchor="_Toc242310176" w:history="1">
+      <w:hyperlink w:anchor="_Toc242311111" w:history="1">
         <w:r>
           <w:rPr>
             <w:rStyle w:val="ad"/>
@@ -213,7 +213,7 @@
             <w:noProof/>
             <w:webHidden/>
           </w:rPr>
-          <w:instrText xml:space="preserve"> PAGEREF _Toc242310176 \h </w:instrText>
+          <w:instrText xml:space="preserve"> PAGEREF _Toc242311111 \h </w:instrText>
         </w:r>
         <w:r>
           <w:rPr>
@@ -259,7 +259,7 @@
           <w14:ligatures w14:val="standardContextual"/>
         </w:rPr>
       </w:pPr>
-      <w:hyperlink w:anchor="_Toc242310177" w:history="1">
+      <w:hyperlink w:anchor="_Toc242311112" w:history="1">
         <w:r>
           <w:rPr>
             <w:rStyle w:val="ad"/>
@@ -286,7 +286,7 @@
             <w:noProof/>
             <w:webHidden/>
           </w:rPr>
-          <w:instrText xml:space="preserve"> PAGEREF _Toc242310177 \h </w:instrText>
+          <w:instrText xml:space="preserve"> PAGEREF _Toc242311112 \h </w:instrText>
         </w:r>
         <w:r>
           <w:rPr>
@@ -332,7 +332,7 @@
           <w14:ligatures w14:val="standardContextual"/>
         </w:rPr>
       </w:pPr>
-      <w:hyperlink w:anchor="_Toc242310178" w:history="1">
+      <w:hyperlink w:anchor="_Toc242311113" w:history="1">
         <w:r>
           <w:rPr>
             <w:rStyle w:val="ad"/>
@@ -359,7 +359,7 @@
             <w:noProof/>
             <w:webHidden/>
           </w:rPr>
-          <w:instrText xml:space="preserve"> PAGEREF _Toc242310178 \h </w:instrText>
+          <w:instrText xml:space="preserve"> PAGEREF _Toc242311113 \h </w:instrText>
         </w:r>
         <w:r>
           <w:rPr>
@@ -405,7 +405,7 @@
           <w14:ligatures w14:val="standardContextual"/>
         </w:rPr>
       </w:pPr>
-      <w:hyperlink w:anchor="_Toc242310179" w:history="1">
+      <w:hyperlink w:anchor="_Toc242311114" w:history="1">
         <w:r>
           <w:rPr>
             <w:rStyle w:val="ad"/>
@@ -456,7 +456,7 @@
             <w:noProof/>
             <w:webHidden/>
           </w:rPr>
-          <w:instrText xml:space="preserve"> PAGEREF _Toc242310179 \h </w:instrText>
+          <w:instrText xml:space="preserve"> PAGEREF _Toc242311114 \h </w:instrText>
         </w:r>
         <w:r>
           <w:rPr>
@@ -502,7 +502,7 @@
           <w14:ligatures w14:val="standardContextual"/>
         </w:rPr>
       </w:pPr>
-      <w:hyperlink w:anchor="_Toc242310180" w:history="1">
+      <w:hyperlink w:anchor="_Toc242311115" w:history="1">
         <w:r>
           <w:rPr>
             <w:rStyle w:val="ad"/>
@@ -553,7 +553,7 @@
             <w:noProof/>
             <w:webHidden/>
           </w:rPr>
-          <w:instrText xml:space="preserve"> PAGEREF _Toc242310180 \h </w:instrText>
+          <w:instrText xml:space="preserve"> PAGEREF _Toc242311115 \h </w:instrText>
         </w:r>
         <w:r>
           <w:rPr>
@@ -599,7 +599,7 @@
           <w14:ligatures w14:val="standardContextual"/>
         </w:rPr>
       </w:pPr>
-      <w:hyperlink w:anchor="_Toc242310181" w:history="1">
+      <w:hyperlink w:anchor="_Toc242311116" w:history="1">
         <w:r>
           <w:rPr>
             <w:rStyle w:val="ad"/>
@@ -650,7 +650,7 @@
             <w:noProof/>
             <w:webHidden/>
           </w:rPr>
-          <w:instrText xml:space="preserve"> PAGEREF _Toc242310181 \h </w:instrText>
+          <w:instrText xml:space="preserve"> PAGEREF _Toc242311116 \h </w:instrText>
         </w:r>
         <w:r>
           <w:rPr>
@@ -696,7 +696,7 @@
           <w14:ligatures w14:val="standardContextual"/>
         </w:rPr>
       </w:pPr>
-      <w:hyperlink w:anchor="_Toc242310182" w:history="1">
+      <w:hyperlink w:anchor="_Toc242311117" w:history="1">
         <w:r>
           <w:rPr>
             <w:rStyle w:val="ad"/>
@@ -723,7 +723,7 @@
             <w:noProof/>
             <w:webHidden/>
           </w:rPr>
-          <w:instrText xml:space="preserve"> PAGEREF _Toc242310182 \h </w:instrText>
+          <w:instrText xml:space="preserve"> PAGEREF _Toc242311117 \h </w:instrText>
         </w:r>
         <w:r>
           <w:rPr>
@@ -769,7 +769,7 @@
           <w14:ligatures w14:val="standardContextual"/>
         </w:rPr>
       </w:pPr>
-      <w:hyperlink w:anchor="_Toc242310183" w:history="1">
+      <w:hyperlink w:anchor="_Toc242311118" w:history="1">
         <w:r>
           <w:rPr>
             <w:rStyle w:val="ad"/>
@@ -796,7 +796,7 @@
             <w:noProof/>
             <w:webHidden/>
           </w:rPr>
-          <w:instrText xml:space="preserve"> PAGEREF _Toc242310183 \h </w:instrText>
+          <w:instrText xml:space="preserve"> PAGEREF _Toc242311118 \h </w:instrText>
         </w:r>
         <w:r>
           <w:rPr>
@@ -842,7 +842,7 @@
           <w14:ligatures w14:val="standardContextual"/>
         </w:rPr>
       </w:pPr>
-      <w:hyperlink w:anchor="_Toc242310184" w:history="1">
+      <w:hyperlink w:anchor="_Toc242311119" w:history="1">
         <w:r>
           <w:rPr>
             <w:rStyle w:val="ad"/>
@@ -869,7 +869,7 @@
             <w:noProof/>
             <w:webHidden/>
           </w:rPr>
-          <w:instrText xml:space="preserve"> PAGEREF _Toc242310184 \h </w:instrText>
+          <w:instrText xml:space="preserve"> PAGEREF _Toc242311119 \h </w:instrText>
         </w:r>
         <w:r>
           <w:rPr>
@@ -915,7 +915,7 @@
           <w14:ligatures w14:val="standardContextual"/>
         </w:rPr>
       </w:pPr>
-      <w:hyperlink w:anchor="_Toc242310185" w:history="1">
+      <w:hyperlink w:anchor="_Toc242311120" w:history="1">
         <w:r>
           <w:rPr>
             <w:rStyle w:val="ad"/>
@@ -942,7 +942,7 @@
             <w:noProof/>
             <w:webHidden/>
           </w:rPr>
-          <w:instrText xml:space="preserve"> PAGEREF _Toc242310185 \h </w:instrText>
+          <w:instrText xml:space="preserve"> PAGEREF _Toc242311120 \h </w:instrText>
         </w:r>
         <w:r>
           <w:rPr>
@@ -988,7 +988,7 @@
           <w14:ligatures w14:val="standardContextual"/>
         </w:rPr>
       </w:pPr>
-      <w:hyperlink w:anchor="_Toc242310186" w:history="1">
+      <w:hyperlink w:anchor="_Toc242311121" w:history="1">
         <w:r>
           <w:rPr>
             <w:rStyle w:val="ad"/>
@@ -1015,7 +1015,7 @@
             <w:noProof/>
             <w:webHidden/>
           </w:rPr>
-          <w:instrText xml:space="preserve"> PAGEREF _Toc242310186 \h </w:instrText>
+          <w:instrText xml:space="preserve"> PAGEREF _Toc242311121 \h </w:instrText>
         </w:r>
         <w:r>
           <w:rPr>
@@ -1061,7 +1061,7 @@
           <w14:ligatures w14:val="standardContextual"/>
         </w:rPr>
       </w:pPr>
-      <w:hyperlink w:anchor="_Toc242310187" w:history="1">
+      <w:hyperlink w:anchor="_Toc242311122" w:history="1">
         <w:r>
           <w:rPr>
             <w:rStyle w:val="ad"/>
@@ -1088,7 +1088,7 @@
             <w:noProof/>
             <w:webHidden/>
           </w:rPr>
-          <w:instrText xml:space="preserve"> PAGEREF _Toc242310187 \h </w:instrText>
+          <w:instrText xml:space="preserve"> PAGEREF _Toc242311122 \h </w:instrText>
         </w:r>
         <w:r>
           <w:rPr>
@@ -1134,7 +1134,7 @@
           <w14:ligatures w14:val="standardContextual"/>
         </w:rPr>
       </w:pPr>
-      <w:hyperlink w:anchor="_Toc242310188" w:history="1">
+      <w:hyperlink w:anchor="_Toc242311123" w:history="1">
         <w:r>
           <w:rPr>
             <w:rStyle w:val="ad"/>
@@ -1161,7 +1161,7 @@
             <w:noProof/>
             <w:webHidden/>
           </w:rPr>
-          <w:instrText xml:space="preserve"> PAGEREF _Toc242310188 \h </w:instrText>
+          <w:instrText xml:space="preserve"> PAGEREF _Toc242311123 \h </w:instrText>
         </w:r>
         <w:r>
           <w:rPr>
@@ -1208,7 +1208,7 @@
         <w:ind w:firstLine="709"/>
         <w:jc w:val="left"/>
       </w:pPr>
-      <w:bookmarkStart w:id="1" w:name="_Toc242310176"/>
+      <w:bookmarkStart w:id="1" w:name="_Toc242311111"/>
       <w:r>
         <w:lastRenderedPageBreak/>
         <w:t>1 ЦЕЛЬ РАБОТЫ</w:t>
@@ -1379,7 +1379,7 @@
         <w:jc w:val="left"/>
       </w:pPr>
       <w:bookmarkStart w:id="2" w:name="ход-работы"/>
-      <w:bookmarkStart w:id="3" w:name="_Toc242310177"/>
+      <w:bookmarkStart w:id="3" w:name="_Toc242311112"/>
       <w:bookmarkEnd w:id="0"/>
       <w:r>
         <w:lastRenderedPageBreak/>
@@ -1395,7 +1395,7 @@
         <w:jc w:val="left"/>
       </w:pPr>
       <w:bookmarkStart w:id="4" w:name="исходные-материалы-и-порядок-работы"/>
-      <w:bookmarkStart w:id="5" w:name="_Toc242310178"/>
+      <w:bookmarkStart w:id="5" w:name="_Toc242311113"/>
       <w:r>
         <w:t>2.1 Исходные материалы и порядок работы</w:t>
       </w:r>
@@ -1891,7 +1891,7 @@
         <w:jc w:val="left"/>
       </w:pPr>
       <w:bookmarkStart w:id="6" w:name="X93d29a5782a4517557fff9d6ebfc303d927dc5a"/>
-      <w:bookmarkStart w:id="7" w:name="_Toc242310179"/>
+      <w:bookmarkStart w:id="7" w:name="_Toc242311114"/>
       <w:bookmarkEnd w:id="4"/>
       <w:r>
         <w:lastRenderedPageBreak/>
@@ -3528,7 +3528,7 @@
         <w:jc w:val="left"/>
       </w:pPr>
       <w:bookmarkStart w:id="12" w:name="X0896298018f4fcc355446c9f8279810908650e0"/>
-      <w:bookmarkStart w:id="13" w:name="_Toc242310180"/>
+      <w:bookmarkStart w:id="13" w:name="_Toc242311115"/>
       <w:bookmarkEnd w:id="6"/>
       <w:bookmarkEnd w:id="11"/>
       <w:r>
@@ -12502,7 +12502,7 @@
         <w:jc w:val="left"/>
       </w:pPr>
       <w:bookmarkStart w:id="20" w:name="X4253a8e12fd5158fd37918e6e474d634b541850"/>
-      <w:bookmarkStart w:id="21" w:name="_Toc242310181"/>
+      <w:bookmarkStart w:id="21" w:name="_Toc242311116"/>
       <w:bookmarkEnd w:id="12"/>
       <w:bookmarkEnd w:id="19"/>
       <w:r>
@@ -16024,7 +16024,7 @@
         <w:jc w:val="left"/>
       </w:pPr>
       <w:bookmarkStart w:id="28" w:name="исправления-рабочих-копий-шаблонов"/>
-      <w:bookmarkStart w:id="29" w:name="_Toc242310182"/>
+      <w:bookmarkStart w:id="29" w:name="_Toc242311117"/>
       <w:bookmarkEnd w:id="20"/>
       <w:bookmarkEnd w:id="27"/>
       <w:r>
@@ -16968,7 +16968,7 @@
         <w:jc w:val="left"/>
       </w:pPr>
       <w:bookmarkStart w:id="30" w:name="проверка-по-критериям-методики"/>
-      <w:bookmarkStart w:id="31" w:name="_Toc242310183"/>
+      <w:bookmarkStart w:id="31" w:name="_Toc242311118"/>
       <w:bookmarkEnd w:id="2"/>
       <w:bookmarkEnd w:id="28"/>
       <w:r>
@@ -18180,7 +18180,7 @@
         <w:spacing w:after="360"/>
       </w:pPr>
       <w:bookmarkStart w:id="32" w:name="выводы"/>
-      <w:bookmarkStart w:id="33" w:name="_Toc242310184"/>
+      <w:bookmarkStart w:id="33" w:name="_Toc242311119"/>
       <w:bookmarkEnd w:id="30"/>
       <w:r>
         <w:lastRenderedPageBreak/>
@@ -18492,7 +18492,7 @@
         <w:spacing w:after="360"/>
       </w:pPr>
       <w:bookmarkStart w:id="34" w:name="список-использованных-источников"/>
-      <w:bookmarkStart w:id="35" w:name="_Toc242310185"/>
+      <w:bookmarkStart w:id="35" w:name="_Toc242311120"/>
       <w:bookmarkEnd w:id="32"/>
       <w:r>
         <w:lastRenderedPageBreak/>
@@ -18506,7 +18506,7 @@
         <w:jc w:val="left"/>
       </w:pPr>
       <w:r>
-        <w:t xml:space="preserve">1 </w:t>
+        <w:t xml:space="preserve">[1] </w:t>
       </w:r>
       <w:r>
         <w:rPr>
@@ -18533,7 +18533,7 @@
         <w:jc w:val="left"/>
       </w:pPr>
       <w:r>
-        <w:t xml:space="preserve">2 </w:t>
+        <w:t xml:space="preserve">[2] </w:t>
       </w:r>
       <w:r>
         <w:rPr>
@@ -18560,7 +18560,7 @@
         <w:jc w:val="left"/>
       </w:pPr>
       <w:r>
-        <w:t xml:space="preserve">3 </w:t>
+        <w:t xml:space="preserve">[3] </w:t>
       </w:r>
       <w:r>
         <w:rPr>
@@ -18587,7 +18587,7 @@
         <w:jc w:val="left"/>
       </w:pPr>
       <w:r>
-        <w:t xml:space="preserve">4 Яндекс Вордстат [Электронный ресурс] : статистика запросов. – Режим доступа: </w:t>
+        <w:t xml:space="preserve">[4] Яндекс Вордстат [Электронный ресурс] : статистика запросов. – Режим доступа: </w:t>
       </w:r>
       <w:r>
         <w:rPr>
@@ -18605,7 +18605,7 @@
         <w:jc w:val="left"/>
       </w:pPr>
       <w:r>
-        <w:t xml:space="preserve">5 </w:t>
+        <w:t xml:space="preserve">[5] </w:t>
       </w:r>
       <w:r>
         <w:rPr>
@@ -18632,7 +18632,7 @@
         <w:jc w:val="left"/>
       </w:pPr>
       <w:r>
-        <w:t xml:space="preserve">6 </w:t>
+        <w:t xml:space="preserve">[6] </w:t>
       </w:r>
       <w:r>
         <w:rPr>
@@ -18659,7 +18659,7 @@
         <w:jc w:val="left"/>
       </w:pPr>
       <w:r>
-        <w:t xml:space="preserve">7 </w:t>
+        <w:t xml:space="preserve">[7] </w:t>
       </w:r>
       <w:r>
         <w:rPr>
@@ -18686,7 +18686,7 @@
         <w:jc w:val="left"/>
       </w:pPr>
       <w:r>
-        <w:t xml:space="preserve">8 </w:t>
+        <w:t xml:space="preserve">[8] </w:t>
       </w:r>
       <w:r>
         <w:rPr>
@@ -18713,7 +18713,7 @@
         <w:jc w:val="left"/>
       </w:pPr>
       <w:r>
-        <w:t xml:space="preserve">9 </w:t>
+        <w:t xml:space="preserve">[9] </w:t>
       </w:r>
       <w:r>
         <w:rPr>
@@ -18740,7 +18740,7 @@
         <w:jc w:val="left"/>
       </w:pPr>
       <w:r>
-        <w:t xml:space="preserve">10 </w:t>
+        <w:t xml:space="preserve">[10] </w:t>
       </w:r>
       <w:r>
         <w:rPr>
@@ -18767,7 +18767,7 @@
         <w:jc w:val="left"/>
       </w:pPr>
       <w:r>
-        <w:t xml:space="preserve">11 </w:t>
+        <w:t xml:space="preserve">[11] </w:t>
       </w:r>
       <w:r>
         <w:rPr>
@@ -18794,7 +18794,7 @@
         <w:jc w:val="left"/>
       </w:pPr>
       <w:r>
-        <w:t xml:space="preserve">12 </w:t>
+        <w:t xml:space="preserve">[12] </w:t>
       </w:r>
       <w:r>
         <w:rPr>
@@ -18821,7 +18821,7 @@
         <w:jc w:val="left"/>
       </w:pPr>
       <w:r>
-        <w:t xml:space="preserve">13 </w:t>
+        <w:t xml:space="preserve">[13] </w:t>
       </w:r>
       <w:r>
         <w:rPr>
@@ -18848,7 +18848,7 @@
         <w:jc w:val="left"/>
       </w:pPr>
       <w:r>
-        <w:t xml:space="preserve">14 </w:t>
+        <w:t xml:space="preserve">[14] </w:t>
       </w:r>
       <w:r>
         <w:rPr>
@@ -18875,7 +18875,7 @@
         <w:jc w:val="left"/>
       </w:pPr>
       <w:r>
-        <w:t xml:space="preserve">15 </w:t>
+        <w:t xml:space="preserve">[15] </w:t>
       </w:r>
       <w:r>
         <w:rPr>
@@ -18920,7 +18920,7 @@
         <w:jc w:val="left"/>
       </w:pPr>
       <w:r>
-        <w:t xml:space="preserve">16 </w:t>
+        <w:t xml:space="preserve">[16] </w:t>
       </w:r>
       <w:r>
         <w:rPr>
@@ -18992,7 +18992,7 @@
         <w:jc w:val="left"/>
       </w:pPr>
       <w:r>
-        <w:t xml:space="preserve">17 </w:t>
+        <w:t xml:space="preserve">[17] </w:t>
       </w:r>
       <w:r>
         <w:rPr>
@@ -19020,7 +19020,7 @@
       </w:pPr>
       <w:r>
         <w:lastRenderedPageBreak/>
-        <w:t xml:space="preserve">18 </w:t>
+        <w:t xml:space="preserve">[18] </w:t>
       </w:r>
       <w:r>
         <w:rPr>
@@ -19084,7 +19084,7 @@
         <w:spacing w:after="360"/>
       </w:pPr>
       <w:bookmarkStart w:id="36" w:name="X0d652d9c320698e7c8068993b30a2dd7ee59c14"/>
-      <w:bookmarkStart w:id="37" w:name="_Toc242310186"/>
+      <w:bookmarkStart w:id="37" w:name="_Toc242311121"/>
       <w:bookmarkEnd w:id="34"/>
       <w:r>
         <w:lastRenderedPageBreak/>
@@ -19777,7 +19777,7 @@
         <w:spacing w:after="360"/>
       </w:pPr>
       <w:bookmarkStart w:id="38" w:name="Xe57dfa954bc99fa1a56051ea98d15e9969e72a7"/>
-      <w:bookmarkStart w:id="39" w:name="_Toc242310187"/>
+      <w:bookmarkStart w:id="39" w:name="_Toc242311122"/>
       <w:bookmarkEnd w:id="36"/>
       <w:r>
         <w:lastRenderedPageBreak/>
@@ -20853,7 +20853,7 @@
         <w:spacing w:after="360"/>
       </w:pPr>
       <w:bookmarkStart w:id="40" w:name="X5524ab9f965042c4d6511d6315044a9f4f6816c"/>
-      <w:bookmarkStart w:id="41" w:name="_Toc242310188"/>
+      <w:bookmarkStart w:id="41" w:name="_Toc242311123"/>
       <w:bookmarkEnd w:id="38"/>
       <w:r>
         <w:lastRenderedPageBreak/>

</xml_diff>